<commit_message>
Audit fixes: places, the demo's inference claims, its Word file and lead, merged names
From the 11 Oct data audit (BACKLOG; each item now says what was fixed and how):
- #12 Places: a property's events reach the address it is linked to (only an Address or RealEstate stands for the
  same spot; a person linked to it does not bring theirs), and a place says how exact its point is, from its notes
  ("exact to the building").
- #12 Demo data: the two inference claims are leads, not Confirmed and Supported; the converted .docx keeps its
  converter's note in its properties instead of its text (its pinned SHA-256 updated); the duplicate lead became next
  actions on the two leads it repeated.
- #2 A merge keeps the merged-away record's names as the surviving record's aliases, so a reading that meets the old
  name finds the record instead of proposing a new one.

Co-Authored-By: Claude Opus 5.5 <noreply@anthropic.com>
Claude-Session: https://claude.ai/code/session_01ViFiL2KRE7Huy4HeFU3gJj
</commit_message>
<xml_diff>
--- a/backend/app/demo/one_mdb/files/doj-2016-complaint-introduction-converted.docx
+++ b/backend/app/demo/one_mdb/files/doj-2016-complaint-introduction-converted.docx
@@ -2,19 +2,6 @@
 <file path=word/document.xml><?xml version="1.0" encoding="utf-8"?>
 <w:document xmlns:wpc="http://schemas.microsoft.com/office/word/2010/wordprocessingCanvas" xmlns:mo="http://schemas.microsoft.com/office/mac/office/2008/main" xmlns:mc="http://schemas.openxmlformats.org/markup-compatibility/2006" xmlns:mv="urn:schemas-microsoft-com:mac:vml" xmlns:o="urn:schemas-microsoft-com:office:office" xmlns:r="http://schemas.openxmlformats.org/officeDocument/2006/relationships" xmlns:m="http://schemas.openxmlformats.org/officeDocument/2006/math" xmlns:v="urn:schemas-microsoft-com:vml" xmlns:wp14="http://schemas.microsoft.com/office/word/2010/wordprocessingDrawing" xmlns:wp="http://schemas.openxmlformats.org/drawingml/2006/wordprocessingDrawing" xmlns:w10="urn:schemas-microsoft-com:office:word" xmlns:w="http://schemas.openxmlformats.org/wordprocessingml/2006/main" xmlns:w14="http://schemas.microsoft.com/office/word/2010/wordml" xmlns:wpg="http://schemas.microsoft.com/office/word/2010/wordprocessingGroup" xmlns:wpi="http://schemas.microsoft.com/office/word/2010/wordprocessingInk" xmlns:wne="http://schemas.microsoft.com/office/word/2006/wordml" xmlns:wps="http://schemas.microsoft.com/office/word/2010/wordprocessingShape" mc:Ignorable="w14 wp14">
   <w:body>
-    <w:p>
-      <w:pPr>
-        <w:pStyle w:val="Heading1"/>
-      </w:pPr>
-      <w:r>
-        <w:t>Converted to Word by the Workbench from United States v. Real Property Located in New York, New York (Park Laurel Condominium), C.D. Cal. No. 2:16-cv-05371, Verified Complaint, paragraphs 6–12</w:t>
-      </w:r>
-    </w:p>
-    <w:p>
-      <w:r>
-        <w:t>Not an original Word file. The text below is copied from pages 6–8 of the complaint filed 20 July 2016 (https://www.justice.gov/media/887166/dl), a work of the U.S. Government in the public domain. Pleading line numbers, page headers and footnotes 2–4 were removed; the footnote markers after “associates.” and “(“U.A.E.”).” were dropped. Nothing else was changed.</w:t>
-      </w:r>
-    </w:p>
     <w:p>
       <w:r>
         <w:t>6. 1MDB was ostensibly created to pursue investment and development projects for the economic benefit of Malaysia and its people, primarily relying on the issuance of various debt securities to fund these projects. However, over the course of an approximately four-year period, between approximately 2009 and at least 2013, multiple individuals, including public officials and their associates, conspired to fraudulently divert billions of dollars from 1MDB through various means, including by defrauding foreign banks and by sending foreign wire communications in furtherance of the scheme, and thereafter, to launder the proceeds of that criminal conduct, including in and through U.S. financial institutions. The funds diverted from 1MDB were used for the personal benefit of the co-conspirators and their relatives and associates, including to purchase luxury real estate in the United States, pay gambling expenses at Las Vegas casinos, acquire more than $200 million in artwork, invest in a major New York real estate development project, and fund the production of major Hollywood films. 1MDB maintained no interest in these assets and saw no returns on these investments.</w:t>

</xml_diff>